<commit_message>
Add branded templates with placeholders, move PDFs to attachments/
- Add {{PLACEHOLDER}} tags to both residential and commercial branded
  templates (12 placeholders each: TENANT_NAMES, PROPERTY_ADDRESS_STREET,
  PROPERTY_ADDRESS_CITY, COUNTY, RENT_DUE_DATE, AMOUNT_DUE,
  TOTAL_AMOUNT_DUE, DATE_SERVED, LANDLORD_NAME, LANDLORD_COMPANY,
  LANDLORD_ADDRESS, LANDLORD_PHONE)
- Update /generate-notice to select template by notice_type
  ("residential" or "commercial")
- Replace table-based amounts with paragraph-based handler (new
  templates use tab-separated paragraphs, not Word tables)
- Fix day count replacement for split runs (THREE/3 in separate runs)
- Move 4 PDF attachments from templates/ to attachments/ with
  underscored filenames
- Update Dockerfile to copy attachments/ directory
- Update TEMPLATE_MAP to reference new commercial template filename

Co-Authored-By: Claude Opus 4.6 <noreply@anthropic.com>
</commit_message>
<xml_diff>
--- a/templates/3-Day Notice - BLUEPRINT - commercial - NEW BRANDING_071125.docx
+++ b/templates/3-Day Notice - BLUEPRINT - commercial - NEW BRANDING_071125.docx
@@ -313,6 +313,9 @@
           </w:cols>
         </w:sectPr>
       </w:pPr>
+      <w:r>
+        <w:t>{{TENANT_NAMES}}</w:t>
+      </w:r>
     </w:p>
     <w:p>
       <w:pPr>
@@ -434,11 +437,17 @@
       <w:pPr>
         <w:pStyle w:val="BodyText"/>
       </w:pPr>
-    </w:p>
-    <w:p>
-      <w:pPr>
-        <w:pStyle w:val="BodyText"/>
-      </w:pPr>
+      <w:r>
+        <w:t>{{PROPERTY_ADDRESS_STREET}}</w:t>
+      </w:r>
+    </w:p>
+    <w:p>
+      <w:pPr>
+        <w:pStyle w:val="BodyText"/>
+      </w:pPr>
+      <w:r>
+        <w:t>{{PROPERTY_ADDRESS_CITY}}</w:t>
+      </w:r>
     </w:p>
     <w:p>
       <w:pPr>
@@ -469,7 +478,7 @@
           <w:color w:val="0B0B0B"/>
           <w:spacing w:val="-5"/>
         </w:rPr>
-        <w:t>OF</w:t>
+        <w:t>OF {{COUNTY}}</w:t>
       </w:r>
     </w:p>
     <w:p>
@@ -905,6 +914,11 @@
           </w:cols>
         </w:sectPr>
       </w:pPr>
+      <w:r>
+        <w:t>{{RENT_DUE_DATE}}</w:t>
+        <w:tab/>
+        <w:t>{{AMOUNT_DUE}}</w:t>
+      </w:r>
     </w:p>
     <w:p>
       <w:pPr>
@@ -973,6 +987,8 @@
           <w:spacing w:val="-4"/>
         </w:rPr>
         <w:t>DUE:</w:t>
+        <w:tab/>
+        <w:t>{{TOTAL_AMOUNT_DUE}}</w:t>
       </w:r>
     </w:p>
     <w:p>
@@ -1240,7 +1256,7 @@
           <w:b w:val="0"/>
           <w:u w:val="single"/>
         </w:rPr>
-        <w:tab/>
+        <w:t>{{DATE_SERVED}}</w:t>
       </w:r>
       <w:r>
         <w:t xml:space="preserve">. You have three (3) days </w:t>
@@ -1602,16 +1618,25 @@
       <w:pPr>
         <w:pStyle w:val="BodyText"/>
       </w:pPr>
-    </w:p>
-    <w:p>
-      <w:pPr>
-        <w:pStyle w:val="BodyText"/>
-      </w:pPr>
-    </w:p>
-    <w:p>
-      <w:pPr>
-        <w:pStyle w:val="BodyText"/>
-      </w:pPr>
+      <w:r>
+        <w:t>{{LANDLORD_NAME}}</w:t>
+      </w:r>
+    </w:p>
+    <w:p>
+      <w:pPr>
+        <w:pStyle w:val="BodyText"/>
+      </w:pPr>
+      <w:r>
+        <w:t>{{LANDLORD_COMPANY}}</w:t>
+      </w:r>
+    </w:p>
+    <w:p>
+      <w:pPr>
+        <w:pStyle w:val="BodyText"/>
+      </w:pPr>
+      <w:r>
+        <w:t>{{LANDLORD_ADDRESS}}</w:t>
+      </w:r>
     </w:p>
     <w:p>
       <w:pPr>
@@ -3961,6 +3986,9 @@
       <w:pPr>
         <w:pStyle w:val="BodyText"/>
       </w:pPr>
+      <w:r>
+        <w:t>{{LANDLORD_ADDRESS}}</w:t>
+      </w:r>
     </w:p>
     <w:p>
       <w:pPr>
@@ -3978,7 +4006,7 @@
           <w:color w:val="0B0B0B"/>
           <w:spacing w:val="-2"/>
         </w:rPr>
-        <w:t>Phone:</w:t>
+        <w:t>Phone: {{LANDLORD_PHONE}}</w:t>
       </w:r>
     </w:p>
     <w:sectPr>

</xml_diff>

<commit_message>
Fix template formatting and add NOTICE_HEADER placeholder
- Fix "To:" and tenant name on same line in both templates
- Left-align property address flush with "To:" line
- Convert DUE DATE / AMOUNT DUE to proper 2-column Word table
- Center TOTAL AMOUNT DUE on single line (remove tab)
- Replace hardcoded header with {{NOTICE_HEADER}} placeholder

Co-Authored-By: Claude Opus 4.6 <noreply@anthropic.com>
</commit_message>
<xml_diff>
--- a/templates/3-Day Notice - BLUEPRINT - commercial - NEW BRANDING_071125.docx
+++ b/templates/3-Day Notice - BLUEPRINT - commercial - NEW BRANDING_071125.docx
@@ -148,7 +148,7 @@
           <w:color w:val="0B0B0B"/>
           <w:spacing w:val="-5"/>
         </w:rPr>
-        <w:t>To:</w:t>
+        <w:t>To: {{TENANT_NAMES}}</w:t>
       </w:r>
     </w:p>
     <w:p>
@@ -159,105 +159,7 @@
         <w:rPr>
           <w:b w:val="0"/>
         </w:rPr>
-        <w:br w:type="column"/>
-      </w:r>
-      <w:r>
-        <w:rPr>
-          <w:color w:val="0B0B0B"/>
-        </w:rPr>
-        <w:t>THREE</w:t>
-      </w:r>
-      <w:r>
-        <w:rPr>
-          <w:color w:val="0B0B0B"/>
-          <w:spacing w:val="-7"/>
-        </w:rPr>
-        <w:t xml:space="preserve"> </w:t>
-      </w:r>
-      <w:r>
-        <w:rPr>
-          <w:color w:val="0B0B0B"/>
-        </w:rPr>
-        <w:t>(3)</w:t>
-      </w:r>
-      <w:r>
-        <w:rPr>
-          <w:color w:val="0B0B0B"/>
-          <w:spacing w:val="-8"/>
-        </w:rPr>
-        <w:t xml:space="preserve"> </w:t>
-      </w:r>
-      <w:r>
-        <w:rPr>
-          <w:color w:val="0B0B0B"/>
-        </w:rPr>
-        <w:t>DAY</w:t>
-      </w:r>
-      <w:r>
-        <w:rPr>
-          <w:color w:val="0B0B0B"/>
-          <w:spacing w:val="-5"/>
-        </w:rPr>
-        <w:t xml:space="preserve"> </w:t>
-      </w:r>
-      <w:r>
-        <w:rPr>
-          <w:color w:val="0B0B0B"/>
-        </w:rPr>
-        <w:t>NOTICE</w:t>
-      </w:r>
-      <w:r>
-        <w:rPr>
-          <w:color w:val="0B0B0B"/>
-          <w:spacing w:val="-8"/>
-        </w:rPr>
-        <w:t xml:space="preserve"> </w:t>
-      </w:r>
-      <w:r>
-        <w:rPr>
-          <w:color w:val="0B0B0B"/>
-        </w:rPr>
-        <w:t>TO</w:t>
-      </w:r>
-      <w:r>
-        <w:rPr>
-          <w:color w:val="0B0B0B"/>
-          <w:spacing w:val="-8"/>
-        </w:rPr>
-        <w:t xml:space="preserve"> </w:t>
-      </w:r>
-      <w:r>
-        <w:rPr>
-          <w:color w:val="0B0B0B"/>
-        </w:rPr>
-        <w:t>PAY</w:t>
-      </w:r>
-      <w:r>
-        <w:rPr>
-          <w:color w:val="0B0B0B"/>
-          <w:spacing w:val="-8"/>
-        </w:rPr>
-        <w:t xml:space="preserve"> </w:t>
-      </w:r>
-      <w:r>
-        <w:rPr>
-          <w:color w:val="0B0B0B"/>
-        </w:rPr>
-        <w:t>OR</w:t>
-      </w:r>
-      <w:r>
-        <w:rPr>
-          <w:color w:val="0B0B0B"/>
-          <w:spacing w:val="-7"/>
-        </w:rPr>
-        <w:t xml:space="preserve"> </w:t>
-      </w:r>
-      <w:r>
-        <w:rPr>
-          <w:color w:val="0B0B0B"/>
-          <w:spacing w:val="-4"/>
-        </w:rPr>
-        <w:t>QUIT</w:t>
+        <w:t>{{NOTICE_HEADER}}</w:t>
       </w:r>
     </w:p>
     <w:p>
@@ -302,23 +204,6 @@
     </w:p>
     <w:p>
       <w:pPr>
-        <w:jc w:val="center"/>
-        <w:sectPr>
-          <w:type w:val="continuous"/>
-          <w:pgSz w:w="12240" w:h="15840"/>
-          <w:pgMar w:top="0" w:right="360" w:bottom="620" w:left="1080" w:header="0" w:footer="432" w:gutter="0"/>
-          <w:cols w:num="2" w:space="720" w:equalWidth="0">
-            <w:col w:w="716" w:space="901"/>
-            <w:col w:w="9183"/>
-          </w:cols>
-        </w:sectPr>
-      </w:pPr>
-      <w:r>
-        <w:t>{{TENANT_NAMES}}</w:t>
-      </w:r>
-    </w:p>
-    <w:p>
-      <w:pPr>
         <w:pStyle w:val="BodyText"/>
         <w:spacing w:before="14"/>
       </w:pPr>
@@ -436,6 +321,7 @@
     <w:p>
       <w:pPr>
         <w:pStyle w:val="BodyText"/>
+        <w:ind w:left="355"/>
       </w:pPr>
       <w:r>
         <w:t>{{PROPERTY_ADDRESS_STREET}}</w:t>
@@ -444,6 +330,7 @@
     <w:p>
       <w:pPr>
         <w:pStyle w:val="BodyText"/>
+        <w:ind w:left="355"/>
       </w:pPr>
       <w:r>
         <w:t>{{PROPERTY_ADDRESS_CITY}}</w:t>
@@ -837,89 +724,111 @@
         </w:sectPr>
       </w:pPr>
     </w:p>
-    <w:p>
-      <w:pPr>
-        <w:spacing w:before="91"/>
-        <w:ind w:left="2534"/>
-        <w:rPr>
-          <w:b/>
-          <w:sz w:val="23"/>
-        </w:rPr>
-      </w:pPr>
-      <w:r>
-        <w:rPr>
-          <w:b/>
-          <w:color w:val="0B0B0B"/>
-          <w:sz w:val="23"/>
-          <w:u w:val="single" w:color="0B0B0B"/>
-        </w:rPr>
-        <w:t xml:space="preserve">DUE </w:t>
-      </w:r>
-      <w:r>
-        <w:rPr>
-          <w:b/>
-          <w:color w:val="0B0B0B"/>
-          <w:spacing w:val="-4"/>
-          <w:sz w:val="23"/>
-          <w:u w:val="single" w:color="0B0B0B"/>
-        </w:rPr>
-        <w:t>DATE</w:t>
-      </w:r>
-    </w:p>
-    <w:p>
-      <w:pPr>
-        <w:spacing w:before="91"/>
-        <w:ind w:left="1169"/>
-        <w:rPr>
-          <w:b/>
-          <w:sz w:val="23"/>
-        </w:rPr>
-      </w:pPr>
-      <w:r>
-        <w:br w:type="column"/>
-      </w:r>
-      <w:r>
-        <w:rPr>
-          <w:b/>
-          <w:color w:val="0B0B0B"/>
-          <w:sz w:val="23"/>
-          <w:u w:val="single" w:color="0B0B0B"/>
-        </w:rPr>
-        <w:t xml:space="preserve">AMOUNT </w:t>
-      </w:r>
-      <w:r>
-        <w:rPr>
-          <w:b/>
-          <w:color w:val="0B0B0B"/>
-          <w:spacing w:val="-5"/>
-          <w:sz w:val="23"/>
-          <w:u w:val="single" w:color="0B0B0B"/>
-        </w:rPr>
-        <w:t>DUE</w:t>
-      </w:r>
-    </w:p>
-    <w:p>
-      <w:pPr>
-        <w:rPr>
-          <w:b/>
-          <w:sz w:val="23"/>
-        </w:rPr>
-        <w:sectPr>
-          <w:type w:val="continuous"/>
-          <w:pgSz w:w="12240" w:h="15840"/>
-          <w:pgMar w:top="0" w:right="360" w:bottom="620" w:left="1080" w:header="0" w:footer="432" w:gutter="0"/>
-          <w:cols w:num="2" w:space="720" w:equalWidth="0">
-            <w:col w:w="4931" w:space="40"/>
-            <w:col w:w="5829"/>
-          </w:cols>
-        </w:sectPr>
-      </w:pPr>
-      <w:r>
-        <w:t>{{RENT_DUE_DATE}}</w:t>
-        <w:tab/>
-        <w:t>{{AMOUNT_DUE}}</w:t>
-      </w:r>
-    </w:p>
+    <w:tbl>
+      <w:tblPr>
+        <w:tblW w:type="auto" w:w="0"/>
+        <w:jc w:val="center"/>
+        <w:tblLook w:firstColumn="1" w:firstRow="1" w:lastColumn="0" w:lastRow="0" w:noHBand="0" w:noVBand="1" w:val="04A0"/>
+      </w:tblPr>
+      <w:tblGrid>
+        <w:gridCol w:w="5400"/>
+        <w:gridCol w:w="5400"/>
+      </w:tblGrid>
+      <w:tr>
+        <w:tc>
+          <w:tcPr>
+            <w:tcW w:type="dxa" w:w="3600"/>
+            <w:tcBorders>
+              <w:top w:val="none" w:sz="0" w:space="0" w:color="auto"/>
+              <w:bottom w:val="none" w:sz="0" w:space="0" w:color="auto"/>
+              <w:start w:val="none" w:sz="0" w:space="0" w:color="auto"/>
+              <w:end w:val="none" w:sz="0" w:space="0" w:color="auto"/>
+            </w:tcBorders>
+          </w:tcPr>
+          <w:p>
+            <w:pPr>
+              <w:jc w:val="center"/>
+            </w:pPr>
+            <w:r>
+              <w:rPr>
+                <w:b/>
+                <w:sz w:val="23"/>
+              </w:rPr>
+              <w:t>DUE DATE</w:t>
+            </w:r>
+          </w:p>
+        </w:tc>
+        <w:tc>
+          <w:tcPr>
+            <w:tcW w:type="dxa" w:w="3600"/>
+            <w:tcBorders>
+              <w:top w:val="none" w:sz="0" w:space="0" w:color="auto"/>
+              <w:bottom w:val="none" w:sz="0" w:space="0" w:color="auto"/>
+              <w:start w:val="none" w:sz="0" w:space="0" w:color="auto"/>
+              <w:end w:val="none" w:sz="0" w:space="0" w:color="auto"/>
+            </w:tcBorders>
+          </w:tcPr>
+          <w:p>
+            <w:pPr>
+              <w:jc w:val="center"/>
+            </w:pPr>
+            <w:r>
+              <w:rPr>
+                <w:b/>
+                <w:sz w:val="23"/>
+              </w:rPr>
+              <w:t>AMOUNT DUE</w:t>
+            </w:r>
+          </w:p>
+        </w:tc>
+      </w:tr>
+      <w:tr>
+        <w:tc>
+          <w:tcPr>
+            <w:tcW w:type="dxa" w:w="3600"/>
+            <w:tcBorders>
+              <w:top w:val="none" w:sz="0" w:space="0" w:color="auto"/>
+              <w:bottom w:val="none" w:sz="0" w:space="0" w:color="auto"/>
+              <w:start w:val="none" w:sz="0" w:space="0" w:color="auto"/>
+              <w:end w:val="none" w:sz="0" w:space="0" w:color="auto"/>
+            </w:tcBorders>
+          </w:tcPr>
+          <w:p>
+            <w:pPr>
+              <w:jc w:val="center"/>
+            </w:pPr>
+            <w:r>
+              <w:rPr>
+                <w:sz w:val="23"/>
+              </w:rPr>
+              <w:t>{{RENT_DUE_DATE}}</w:t>
+            </w:r>
+          </w:p>
+        </w:tc>
+        <w:tc>
+          <w:tcPr>
+            <w:tcW w:type="dxa" w:w="3600"/>
+            <w:tcBorders>
+              <w:top w:val="none" w:sz="0" w:space="0" w:color="auto"/>
+              <w:bottom w:val="none" w:sz="0" w:space="0" w:color="auto"/>
+              <w:start w:val="none" w:sz="0" w:space="0" w:color="auto"/>
+              <w:end w:val="none" w:sz="0" w:space="0" w:color="auto"/>
+            </w:tcBorders>
+          </w:tcPr>
+          <w:p>
+            <w:pPr>
+              <w:jc w:val="center"/>
+            </w:pPr>
+            <w:r>
+              <w:rPr>
+                <w:sz w:val="23"/>
+              </w:rPr>
+              <w:t>{{AMOUNT_DUE}}</w:t>
+            </w:r>
+          </w:p>
+        </w:tc>
+      </w:tr>
+    </w:tbl>
     <w:p>
       <w:pPr>
         <w:pStyle w:val="BodyText"/>
@@ -973,22 +882,14 @@
       <w:pPr>
         <w:pStyle w:val="Heading1"/>
         <w:spacing w:before="0"/>
-        <w:ind w:left="2541"/>
-      </w:pPr>
-      <w:r>
-        <w:rPr>
-          <w:color w:val="0B0B0B"/>
-        </w:rPr>
-        <w:t xml:space="preserve">TOTAL AMOUNT </w:t>
-      </w:r>
-      <w:r>
-        <w:rPr>
-          <w:color w:val="0B0B0B"/>
-          <w:spacing w:val="-4"/>
-        </w:rPr>
-        <w:t>DUE:</w:t>
-        <w:tab/>
-        <w:t>{{TOTAL_AMOUNT_DUE}}</w:t>
+        <w:ind/>
+        <w:jc w:val="center"/>
+      </w:pPr>
+      <w:r>
+        <w:rPr>
+          <w:color w:val="0B0B0B"/>
+        </w:rPr>
+        <w:t>TOTAL AMOUNT DUE: {{TOTAL_AMOUNT_DUE}}</w:t>
       </w:r>
     </w:p>
     <w:p>

</xml_diff>

<commit_message>
Fix template formatting and add dynamic NOTICE_HEADER support
- Fix To:/TENANT_NAMES: insert "To: {{TENANT_NAMES}}" line before address block
- Fix address alignment: left-indent flush with To: line
- Convert DUE DATE/AMOUNT DUE to proper 2-column Word table
- Center TOTAL AMOUNT DUE on single line
- Add {{NOTICE_HEADER}} placeholder to both templates
- Update main.py: add notice_header field to GenerateNoticeRequest,
  compute default header from day_count, replace in table cells
- Update _fill_amounts_paragraph to handle Word table layout

Co-Authored-By: Claude Opus 4.6 <noreply@anthropic.com>
</commit_message>
<xml_diff>
--- a/templates/3-Day Notice - BLUEPRINT - commercial - NEW BRANDING_071125.docx
+++ b/templates/3-Day Notice - BLUEPRINT - commercial - NEW BRANDING_071125.docx
@@ -140,19 +140,6 @@
     </w:p>
     <w:p>
       <w:pPr>
-        <w:pStyle w:val="BodyText"/>
-        <w:ind w:left="355"/>
-      </w:pPr>
-      <w:r>
-        <w:rPr>
-          <w:color w:val="0B0B0B"/>
-          <w:spacing w:val="-5"/>
-        </w:rPr>
-        <w:t>To: {{TENANT_NAMES}}</w:t>
-      </w:r>
-    </w:p>
-    <w:p>
-      <w:pPr>
         <w:pStyle w:val="Title"/>
       </w:pPr>
       <w:r>
@@ -207,6 +194,18 @@
         <w:pStyle w:val="BodyText"/>
         <w:spacing w:before="14"/>
       </w:pPr>
+    </w:p>
+    <w:p>
+      <w:pPr>
+        <w:pStyle w:val="BodyText"/>
+        <w:ind w:left="355"/>
+      </w:pPr>
+      <w:r>
+        <w:rPr>
+          <w:b/>
+        </w:rPr>
+        <w:t>To: {{TENANT_NAMES}}</w:t>
+      </w:r>
     </w:p>
     <w:p>
       <w:pPr>

</xml_diff>

<commit_message>
Bump w:bottom to 900 twips on all template sectPrs
Residential: 660 -> 900 across 3 sectPrs.
Commercial: 620/660 -> 900 across 4 sectPrs (consistent across notice types).

Verified 2-page fit on rendered PDFs at row counts 1/5/8/12 for both templates
via LibreOffice headless. No fallback needed.

Co-Authored-By: Claude Opus 4.7 (1M context) <noreply@anthropic.com>
</commit_message>
<xml_diff>
--- a/templates/3-Day Notice - BLUEPRINT - commercial - NEW BRANDING_071125.docx
+++ b/templates/3-Day Notice - BLUEPRINT - commercial - NEW BRANDING_071125.docx
@@ -116,7 +116,7 @@
           <w:footerReference w:type="default" r:id="rId11"/>
           <w:type w:val="continuous"/>
           <w:pgSz w:w="12240" w:h="15840"/>
-          <w:pgMar w:top="0" w:right="360" w:bottom="620" w:left="1080" w:header="0" w:footer="432" w:gutter="0"/>
+          <w:pgMar w:top="0" w:right="360" w:bottom="900" w:left="1080" w:header="0" w:footer="432" w:gutter="0"/>
           <w:pgNumType w:start="1"/>
           <w:cols w:space="720"/>
         </w:sectPr>
@@ -718,7 +718,7 @@
         <w:sectPr>
           <w:type w:val="continuous"/>
           <w:pgSz w:w="12240" w:h="15840"/>
-          <w:pgMar w:top="0" w:right="360" w:bottom="620" w:left="1080" w:header="0" w:footer="432" w:gutter="0"/>
+          <w:pgMar w:top="0" w:right="360" w:bottom="900" w:left="1080" w:header="0" w:footer="432" w:gutter="0"/>
           <w:cols w:space="720"/>
         </w:sectPr>
       </w:pPr>
@@ -2011,7 +2011,7 @@
         <w:sectPr>
           <w:type w:val="continuous"/>
           <w:pgSz w:w="12240" w:h="15840"/>
-          <w:pgMar w:top="0" w:right="360" w:bottom="620" w:left="1080" w:header="0" w:footer="432" w:gutter="0"/>
+          <w:pgMar w:top="0" w:right="360" w:bottom="900" w:left="1080" w:header="0" w:footer="432" w:gutter="0"/>
           <w:cols w:space="720"/>
         </w:sectPr>
       </w:pPr>
@@ -3911,7 +3911,7 @@
     </w:p>
     <w:sectPr>
       <w:pgSz w:w="12240" w:h="15840"/>
-      <w:pgMar w:top="0" w:right="360" w:bottom="660" w:left="1080" w:header="0" w:footer="432" w:gutter="0"/>
+      <w:pgMar w:top="0" w:right="360" w:bottom="900" w:left="1080" w:header="0" w:footer="432" w:gutter="0"/>
       <w:cols w:space="720"/>
     </w:sectPr>
   </w:body>

</xml_diff>